<commit_message>
feat: add price total to reimbursement template
</commit_message>
<xml_diff>
--- a/.agents/skills/expense/assets/报销内容简要说明.docx
+++ b/.agents/skills/expense/assets/报销内容简要说明.docx
@@ -124,6 +124,25 @@
           <w:shd w:val="clear" w:color="auto" w:fill="FFFFFF"/>
         </w:rPr>
         <w:t>2.{{同类物品名称}}：{{合并用途}}。</w:t>
+      </w:r>
+    </w:p>
+    <w:p>
+      <w:pPr>
+        <w:spacing w:line="360" w:lineRule="auto"/>
+        <w:ind w:firstLine="480" w:firstLineChars="200"/>
+        <w:rPr>
+          <w:rFonts w:ascii="Segoe UI" w:hAnsi="Segoe UI" w:eastAsia="Segoe UI" w:cs="Segoe UI"/>
+          <w:sz w:val="24"/>
+          <w:shd w:val="clear" w:color="auto" w:fill="FFFFFF"/>
+        </w:rPr>
+      </w:pPr>
+      <w:r>
+        <w:rPr>
+          <w:rFonts w:hint="eastAsia" w:ascii="Songti SC" w:hAnsi="Songti SC" w:eastAsia="Songti SC" w:cs="Songti SC"/>
+          <w:sz w:val="24"/>
+          <w:shd w:val="clear" w:color="auto" w:fill="FFFFFF"/>
+        </w:rPr>
+        <w:t>价格总计：{{价格总计}} 元</w:t>
       </w:r>
     </w:p>
     <w:p>

</xml_diff>